<commit_message>
Add role-based registration and CodeWithKris Administrator category
</commit_message>
<xml_diff>
--- a/Doc/MobileApplicationBuildPrompt.docx
+++ b/Doc/MobileApplicationBuildPrompt.docx
@@ -8,6 +8,12 @@
           <w:lang w:val="en-US"/>
         </w:rPr>
       </w:pPr>
+      <w:r>
+        <w:rPr>
+          <w:lang w:val="en-US"/>
+        </w:rPr>
+        <w:t>22 Aug 2026</w:t>
+      </w:r>
     </w:p>
     <w:p>
       <w:pPr>
@@ -22,34 +28,6 @@
           <w:bCs/>
         </w:rPr>
         <w:t>Mobile Application Build Prompt for Non-Coders</w:t>
-      </w:r>
-    </w:p>
-    <w:p>
-      <w:r>
-        <w:t xml:space="preserve">Copy and paste the prompt below into an AI app builder (such as </w:t>
-      </w:r>
-      <w:proofErr w:type="spellStart"/>
-      <w:r>
-        <w:t>FlutterFlow</w:t>
-      </w:r>
-      <w:proofErr w:type="spellEnd"/>
-      <w:r>
-        <w:t>, Glide, Bubble, or an AI code assistant like v0/Cursor) to generate the mobile application based on the attached wireframes and our core product context.</w:t>
-      </w:r>
-    </w:p>
-    <w:p>
-      <w:pPr>
-        <w:rPr>
-          <w:b/>
-          <w:bCs/>
-        </w:rPr>
-      </w:pPr>
-      <w:r>
-        <w:rPr>
-          <w:b/>
-          <w:bCs/>
-        </w:rPr>
-        <w:t>COPY FROM HERE DOWN:</w:t>
       </w:r>
     </w:p>
     <w:p>
@@ -118,6 +96,14 @@
       </w:r>
     </w:p>
     <w:p>
+      <w:pPr>
+        <w:rPr>
+          <w:b/>
+          <w:bCs/>
+        </w:rPr>
+      </w:pPr>
+    </w:p>
+    <w:p>
       <w:r>
         <w:rPr>
           <w:b/>
@@ -314,40 +300,40 @@
           <w:b/>
           <w:bCs/>
         </w:rPr>
+        <w:t>Action Button:</w:t>
+      </w:r>
+      <w:r>
+        <w:t xml:space="preserve"> "Create Account" (Leading to Sign In or Dashboard).</w:t>
+      </w:r>
+    </w:p>
+    <w:p>
+      <w:pPr>
+        <w:numPr>
+          <w:ilvl w:val="0"/>
+          <w:numId w:val="2"/>
+        </w:numPr>
+      </w:pPr>
+      <w:r>
+        <w:rPr>
+          <w:b/>
+          <w:bCs/>
+        </w:rPr>
+        <w:t>Sign In Screen (Sign In)</w:t>
+      </w:r>
+    </w:p>
+    <w:p>
+      <w:pPr>
+        <w:numPr>
+          <w:ilvl w:val="1"/>
+          <w:numId w:val="2"/>
+        </w:numPr>
+      </w:pPr>
+      <w:r>
+        <w:rPr>
+          <w:b/>
+          <w:bCs/>
+        </w:rPr>
         <w:lastRenderedPageBreak/>
-        <w:t>Action Button:</w:t>
-      </w:r>
-      <w:r>
-        <w:t xml:space="preserve"> "Create Account" (Leading to Sign In or Dashboard).</w:t>
-      </w:r>
-    </w:p>
-    <w:p>
-      <w:pPr>
-        <w:numPr>
-          <w:ilvl w:val="0"/>
-          <w:numId w:val="2"/>
-        </w:numPr>
-      </w:pPr>
-      <w:r>
-        <w:rPr>
-          <w:b/>
-          <w:bCs/>
-        </w:rPr>
-        <w:t>Sign In Screen (Sign In)</w:t>
-      </w:r>
-    </w:p>
-    <w:p>
-      <w:pPr>
-        <w:numPr>
-          <w:ilvl w:val="1"/>
-          <w:numId w:val="2"/>
-        </w:numPr>
-      </w:pPr>
-      <w:r>
-        <w:rPr>
-          <w:b/>
-          <w:bCs/>
-        </w:rPr>
         <w:t>Header:</w:t>
       </w:r>
       <w:r>
@@ -768,40 +754,40 @@
           <w:b/>
           <w:bCs/>
         </w:rPr>
+        <w:t>Personal Dashboard (Personal Dashboard equivalent -&gt; Your Progress)</w:t>
+      </w:r>
+    </w:p>
+    <w:p>
+      <w:pPr>
+        <w:numPr>
+          <w:ilvl w:val="1"/>
+          <w:numId w:val="2"/>
+        </w:numPr>
+      </w:pPr>
+      <w:r>
+        <w:rPr>
+          <w:b/>
+          <w:bCs/>
+        </w:rPr>
+        <w:t>Header:</w:t>
+      </w:r>
+      <w:r>
+        <w:t xml:space="preserve"> Track your improvement journey.</w:t>
+      </w:r>
+    </w:p>
+    <w:p>
+      <w:pPr>
+        <w:numPr>
+          <w:ilvl w:val="1"/>
+          <w:numId w:val="2"/>
+        </w:numPr>
+      </w:pPr>
+      <w:r>
+        <w:rPr>
+          <w:b/>
+          <w:bCs/>
+        </w:rPr>
         <w:lastRenderedPageBreak/>
-        <w:t>Personal Dashboard (Personal Dashboard equivalent -&gt; Your Progress)</w:t>
-      </w:r>
-    </w:p>
-    <w:p>
-      <w:pPr>
-        <w:numPr>
-          <w:ilvl w:val="1"/>
-          <w:numId w:val="2"/>
-        </w:numPr>
-      </w:pPr>
-      <w:r>
-        <w:rPr>
-          <w:b/>
-          <w:bCs/>
-        </w:rPr>
-        <w:t>Header:</w:t>
-      </w:r>
-      <w:r>
-        <w:t xml:space="preserve"> Track your improvement journey.</w:t>
-      </w:r>
-    </w:p>
-    <w:p>
-      <w:pPr>
-        <w:numPr>
-          <w:ilvl w:val="1"/>
-          <w:numId w:val="2"/>
-        </w:numPr>
-      </w:pPr>
-      <w:r>
-        <w:rPr>
-          <w:b/>
-          <w:bCs/>
-        </w:rPr>
         <w:t>Key Metrics Cards:</w:t>
       </w:r>
       <w:r>

</xml_diff>